<commit_message>
Remove related artifacts from requirements definition
</commit_message>
<xml_diff>
--- a/docs/submission/requirements_definition.docx
+++ b/docs/submission/requirements_definition.docx
@@ -2,7 +2,7 @@
 <file path=word/document.xml><?xml version="1.0" encoding="utf-8"?>
 <w:document xmlns:w="http://schemas.openxmlformats.org/wordprocessingml/2006/main" xmlns:m="http://schemas.openxmlformats.org/officeDocument/2006/math" xmlns:r="http://schemas.openxmlformats.org/officeDocument/2006/relationships" xmlns:o="urn:schemas-microsoft-com:office:office" xmlns:v="urn:schemas-microsoft-com:vml" xmlns:w10="urn:schemas-microsoft-com:office:word" xmlns:a="http://schemas.openxmlformats.org/drawingml/2006/main" xmlns:pic="http://schemas.openxmlformats.org/drawingml/2006/picture" xmlns:wp="http://schemas.openxmlformats.org/drawingml/2006/wordprocessingDrawing">
   <w:body>
-    <w:bookmarkStart w:id="18" w:name="요구사항-정의서"/>
+    <w:bookmarkStart w:id="17" w:name="요구사항-정의서"/>
     <w:p>
       <w:pPr>
         <w:pStyle w:val="Heading1"/>
@@ -1526,353 +1526,7 @@
       </w:r>
     </w:p>
     <w:bookmarkEnd w:id="16"/>
-    <w:bookmarkStart w:id="17" w:name="관련-산출물"/>
-    <w:p>
-      <w:pPr>
-        <w:pStyle w:val="Heading2"/>
-      </w:pPr>
-      <w:r>
-        <w:t xml:space="preserve">9. 관련 산출물</w:t>
-      </w:r>
-    </w:p>
-    <w:tbl>
-      <w:tblPr>
-        <w:tblStyle w:val="Table"/>
-        <w:tblW w:type="pct" w:w="5000"/>
-        <w:tblLayout w:type="fixed"/>
-        <w:tblLook w:firstRow="1" w:lastRow="0" w:firstColumn="0" w:lastColumn="0" w:noHBand="0" w:noVBand="0" w:val="0020"/>
-      </w:tblPr>
-      <w:tblGrid>
-        <w:gridCol w:w="3960"/>
-        <w:gridCol w:w="3960"/>
-      </w:tblGrid>
-      <w:tr>
-        <w:trPr>
-          <w:tblHeader w:val="on"/>
-        </w:trPr>
-        <w:tc>
-          <w:tcPr/>
-          <w:p>
-            <w:pPr>
-              <w:pStyle w:val="Compact"/>
-            </w:pPr>
-            <w:r>
-              <w:t xml:space="preserve">산출물</w:t>
-            </w:r>
-          </w:p>
-        </w:tc>
-        <w:tc>
-          <w:tcPr/>
-          <w:p>
-            <w:pPr>
-              <w:pStyle w:val="Compact"/>
-            </w:pPr>
-            <w:r>
-              <w:t xml:space="preserve">경로</w:t>
-            </w:r>
-          </w:p>
-        </w:tc>
-      </w:tr>
-      <w:tr>
-        <w:tc>
-          <w:tcPr/>
-          <w:p>
-            <w:pPr>
-              <w:pStyle w:val="Compact"/>
-            </w:pPr>
-            <w:r>
-              <w:t xml:space="preserve">핵심 제출 요약</w:t>
-            </w:r>
-          </w:p>
-        </w:tc>
-        <w:tc>
-          <w:tcPr/>
-          <w:p>
-            <w:pPr>
-              <w:pStyle w:val="Compact"/>
-            </w:pPr>
-            <w:r>
-              <w:rPr>
-                <w:rStyle w:val="VerbatimChar"/>
-              </w:rPr>
-              <w:t xml:space="preserve">docs/core_submission_summary.md</w:t>
-            </w:r>
-          </w:p>
-        </w:tc>
-      </w:tr>
-      <w:tr>
-        <w:tc>
-          <w:tcPr/>
-          <w:p>
-            <w:pPr>
-              <w:pStyle w:val="Compact"/>
-            </w:pPr>
-            <w:r>
-              <w:t xml:space="preserve">기능/API 가이드</w:t>
-            </w:r>
-          </w:p>
-        </w:tc>
-        <w:tc>
-          <w:tcPr/>
-          <w:p>
-            <w:pPr>
-              <w:pStyle w:val="Compact"/>
-            </w:pPr>
-            <w:r>
-              <w:rPr>
-                <w:rStyle w:val="VerbatimChar"/>
-              </w:rPr>
-              <w:t xml:space="preserve">docs/submission/functional_api_guide.md</w:t>
-            </w:r>
-          </w:p>
-        </w:tc>
-      </w:tr>
-      <w:tr>
-        <w:tc>
-          <w:tcPr/>
-          <w:p>
-            <w:pPr>
-              <w:pStyle w:val="Compact"/>
-            </w:pPr>
-            <w:r>
-              <w:t xml:space="preserve">OpenAPI 계약</w:t>
-            </w:r>
-          </w:p>
-        </w:tc>
-        <w:tc>
-          <w:tcPr/>
-          <w:p>
-            <w:pPr>
-              <w:pStyle w:val="Compact"/>
-            </w:pPr>
-            <w:r>
-              <w:rPr>
-                <w:rStyle w:val="VerbatimChar"/>
-              </w:rPr>
-              <w:t xml:space="preserve">docs/submission/openapi_service_control.yaml</w:t>
-            </w:r>
-          </w:p>
-        </w:tc>
-      </w:tr>
-      <w:tr>
-        <w:tc>
-          <w:tcPr/>
-          <w:p>
-            <w:pPr>
-              <w:pStyle w:val="Compact"/>
-            </w:pPr>
-            <w:r>
-              <w:t xml:space="preserve">설치 및 실행 가이드</w:t>
-            </w:r>
-          </w:p>
-        </w:tc>
-        <w:tc>
-          <w:tcPr/>
-          <w:p>
-            <w:pPr>
-              <w:pStyle w:val="Compact"/>
-            </w:pPr>
-            <w:r>
-              <w:rPr>
-                <w:rStyle w:val="VerbatimChar"/>
-              </w:rPr>
-              <w:t xml:space="preserve">docs/submission/install_and_run_guide.md</w:t>
-            </w:r>
-          </w:p>
-        </w:tc>
-      </w:tr>
-      <w:tr>
-        <w:tc>
-          <w:tcPr/>
-          <w:p>
-            <w:pPr>
-              <w:pStyle w:val="Compact"/>
-            </w:pPr>
-            <w:r>
-              <w:t xml:space="preserve">테스트 가이드</w:t>
-            </w:r>
-          </w:p>
-        </w:tc>
-        <w:tc>
-          <w:tcPr/>
-          <w:p>
-            <w:pPr>
-              <w:pStyle w:val="Compact"/>
-            </w:pPr>
-            <w:r>
-              <w:rPr>
-                <w:rStyle w:val="VerbatimChar"/>
-              </w:rPr>
-              <w:t xml:space="preserve">docs/submission/test_guide.md</w:t>
-            </w:r>
-          </w:p>
-        </w:tc>
-      </w:tr>
-      <w:tr>
-        <w:tc>
-          <w:tcPr/>
-          <w:p>
-            <w:pPr>
-              <w:pStyle w:val="Compact"/>
-            </w:pPr>
-            <w:r>
-              <w:t xml:space="preserve">LLM 운영 관리 구조 설계서</w:t>
-            </w:r>
-          </w:p>
-        </w:tc>
-        <w:tc>
-          <w:tcPr/>
-          <w:p>
-            <w:pPr>
-              <w:pStyle w:val="Compact"/>
-            </w:pPr>
-            <w:r>
-              <w:rPr>
-                <w:rStyle w:val="VerbatimChar"/>
-              </w:rPr>
-              <w:t xml:space="preserve">docs/deliverables/01_llm_operation_management_design.md</w:t>
-            </w:r>
-          </w:p>
-        </w:tc>
-      </w:tr>
-      <w:tr>
-        <w:tc>
-          <w:tcPr/>
-          <w:p>
-            <w:pPr>
-              <w:pStyle w:val="Compact"/>
-            </w:pPr>
-            <w:r>
-              <w:t xml:space="preserve">에이전트 등록 관리 프로토타입</w:t>
-            </w:r>
-          </w:p>
-        </w:tc>
-        <w:tc>
-          <w:tcPr/>
-          <w:p>
-            <w:pPr>
-              <w:pStyle w:val="Compact"/>
-            </w:pPr>
-            <w:r>
-              <w:rPr>
-                <w:rStyle w:val="VerbatimChar"/>
-              </w:rPr>
-              <w:t xml:space="preserve">docs/deliverables/02_agent_registration_management_prototype.md</w:t>
-            </w:r>
-          </w:p>
-        </w:tc>
-      </w:tr>
-      <w:tr>
-        <w:tc>
-          <w:tcPr/>
-          <w:p>
-            <w:pPr>
-              <w:pStyle w:val="Compact"/>
-            </w:pPr>
-            <w:r>
-              <w:t xml:space="preserve">AI 응용 배포·제어 추론 최적화 전략 설계서</w:t>
-            </w:r>
-          </w:p>
-        </w:tc>
-        <w:tc>
-          <w:tcPr/>
-          <w:p>
-            <w:pPr>
-              <w:pStyle w:val="Compact"/>
-            </w:pPr>
-            <w:r>
-              <w:rPr>
-                <w:rStyle w:val="VerbatimChar"/>
-              </w:rPr>
-              <w:t xml:space="preserve">docs/deliverables/03_ai_application_deployment_control_optimization_strategy.md</w:t>
-            </w:r>
-          </w:p>
-        </w:tc>
-      </w:tr>
-      <w:tr>
-        <w:tc>
-          <w:tcPr/>
-          <w:p>
-            <w:pPr>
-              <w:pStyle w:val="Compact"/>
-            </w:pPr>
-            <w:r>
-              <w:t xml:space="preserve">LLM 정책 설정</w:t>
-            </w:r>
-          </w:p>
-        </w:tc>
-        <w:tc>
-          <w:tcPr/>
-          <w:p>
-            <w:pPr>
-              <w:pStyle w:val="Compact"/>
-            </w:pPr>
-            <w:r>
-              <w:rPr>
-                <w:rStyle w:val="VerbatimChar"/>
-              </w:rPr>
-              <w:t xml:space="preserve">config/ops_llm_benchmark.json</w:t>
-            </w:r>
-          </w:p>
-        </w:tc>
-      </w:tr>
-      <w:tr>
-        <w:tc>
-          <w:tcPr/>
-          <w:p>
-            <w:pPr>
-              <w:pStyle w:val="Compact"/>
-            </w:pPr>
-            <w:r>
-              <w:t xml:space="preserve">에이전트 registry 설정</w:t>
-            </w:r>
-          </w:p>
-        </w:tc>
-        <w:tc>
-          <w:tcPr/>
-          <w:p>
-            <w:pPr>
-              <w:pStyle w:val="Compact"/>
-            </w:pPr>
-            <w:r>
-              <w:rPr>
-                <w:rStyle w:val="VerbatimChar"/>
-              </w:rPr>
-              <w:t xml:space="preserve">config/agent_registry.json</w:t>
-            </w:r>
-          </w:p>
-        </w:tc>
-      </w:tr>
-      <w:tr>
-        <w:tc>
-          <w:tcPr/>
-          <w:p>
-            <w:pPr>
-              <w:pStyle w:val="Compact"/>
-            </w:pPr>
-            <w:r>
-              <w:t xml:space="preserve">추론 최적화 설정</w:t>
-            </w:r>
-          </w:p>
-        </w:tc>
-        <w:tc>
-          <w:tcPr/>
-          <w:p>
-            <w:pPr>
-              <w:pStyle w:val="Compact"/>
-            </w:pPr>
-            <w:r>
-              <w:rPr>
-                <w:rStyle w:val="VerbatimChar"/>
-              </w:rPr>
-              <w:t xml:space="preserve">config/inference_optimization.json</w:t>
-            </w:r>
-          </w:p>
-        </w:tc>
-      </w:tr>
-    </w:tbl>
     <w:bookmarkEnd w:id="17"/>
-    <w:bookmarkEnd w:id="18"/>
     <w:sectPr>
       <w:footnotePr>
         <w:numRestart w:val="eachSect"/>

</xml_diff>

<commit_message>
Refine requirements definition around acceptance criteria
</commit_message>
<xml_diff>
--- a/docs/submission/requirements_definition.docx
+++ b/docs/submission/requirements_definition.docx
@@ -33,7 +33,20 @@
         <w:pStyle w:val="FirstParagraph"/>
       </w:pPr>
       <w:r>
-        <w:t xml:space="preserve">이 문서는 1차년도 Go 기반 서비스 제어 기능 프로토타입의 기능 요구사항, 비기능 요구사항, 제출 요구사항, 개발 요구사항, 검증 요구사항을 정의합니다. 프로토타입은 AI LLM 운영 관리, AI 에이전트 등록 관리, CPU/GPU VM 배치 추천, AI 응용 배포·제어 준비도 검증을 지원합니다.</w:t>
+        <w:t xml:space="preserve">이 문서는 1차년도</w:t>
+      </w:r>
+      <w:r>
+        <w:t xml:space="preserve"> </w:t>
+      </w:r>
+      <w:r>
+        <w:rPr>
+          <w:b/>
+          <w:bCs/>
+        </w:rPr>
+        <w:t xml:space="preserve">AI 기반 서비스 제어 및 관리 자동화 프레임워크</w:t>
+      </w:r>
+      <w:r>
+        <w:t xml:space="preserve">에서 요구되는 기능, 품질, 산출물, 검증 기준을 정의합니다. 요구사항은 특정 구현 결과를 나열하기 위한 것이 아니라, 연구 과제 수행과 프로토타입 검증을 위해 시스템이 갖추어야 할 필요 조건을 정리한 것입니다.</w:t>
       </w:r>
     </w:p>
     <w:p>
@@ -45,13 +58,13 @@
       </w:r>
     </w:p>
     <w:bookmarkEnd w:id="9"/>
-    <w:bookmarkStart w:id="10" w:name="프로젝트-범위"/>
+    <w:bookmarkStart w:id="10" w:name="요구-범위"/>
     <w:p>
       <w:pPr>
         <w:pStyle w:val="Heading2"/>
       </w:pPr>
       <w:r>
-        <w:t xml:space="preserve">2. 프로젝트 범위</w:t>
+        <w:t xml:space="preserve">2. 요구 범위</w:t>
       </w:r>
     </w:p>
     <w:p>
@@ -59,7 +72,7 @@
         <w:pStyle w:val="FirstParagraph"/>
       </w:pPr>
       <w:r>
-        <w:t xml:space="preserve">프로젝트 범위는 1차년도 기능 프로토타입으로 제한합니다. 저장소는 담당 연구 범위를 입증하기 위한 Go API/CLI 구성요소, JSON 설정 파일, 설계 산출물, 검증 문서를 제공합니다.</w:t>
+        <w:t xml:space="preserve">1차년도 요구 범위는 AI LLM 운영 관리와 AI 응용 배포·제어 판단을 로컬에서 재현 가능한 형태로 검증할 수 있는 기능 프로토타입입니다. 시스템은 Go 기반 API/CLI로 실행 가능해야 하며, 정책과 입력 데이터는 검토 가능한 설정 파일로 분리되어야 합니다.</w:t>
       </w:r>
     </w:p>
     <w:p>
@@ -67,7 +80,7 @@
         <w:pStyle w:val="BodyText"/>
       </w:pPr>
       <w:r>
-        <w:t xml:space="preserve">포함 범위는 다음과 같습니다.</w:t>
+        <w:t xml:space="preserve">필수 포함 범위는 다음과 같습니다.</w:t>
       </w:r>
     </w:p>
     <w:p>
@@ -79,7 +92,7 @@
         </w:numPr>
       </w:pPr>
       <w:r>
-        <w:t xml:space="preserve">Ops LLM 선정 정책 프로토타입</w:t>
+        <w:t xml:space="preserve">Ops 분석 시험을 위한 LLM 후보 선정 기준 정의</w:t>
       </w:r>
     </w:p>
     <w:p>
@@ -91,7 +104,7 @@
         </w:numPr>
       </w:pPr>
       <w:r>
-        <w:t xml:space="preserve">AI LLM 운영 관리 구조 검증</w:t>
+        <w:t xml:space="preserve">AI LLM 운영 관리 구조와 실행 흐름 정의</w:t>
       </w:r>
     </w:p>
     <w:p>
@@ -103,7 +116,7 @@
         </w:numPr>
       </w:pPr>
       <w:r>
-        <w:t xml:space="preserve">에이전트 registry 조회 및 bounded action 검증</w:t>
+        <w:t xml:space="preserve">AI 에이전트 등록 정보와 허용 action 경계 관리</w:t>
       </w:r>
     </w:p>
     <w:p>
@@ -115,7 +128,7 @@
         </w:numPr>
       </w:pPr>
       <w:r>
-        <w:t xml:space="preserve">AI 응용 워크로드를 위한 CPU/GPU VM 배치 추천</w:t>
+        <w:t xml:space="preserve">CPU/GPU VM 기반 AI 응용 배치 판단 기준 정의</w:t>
       </w:r>
     </w:p>
     <w:p>
@@ -127,7 +140,7 @@
         </w:numPr>
       </w:pPr>
       <w:r>
-        <w:t xml:space="preserve">Kubernetes 배포 계획 생성</w:t>
+        <w:t xml:space="preserve">AI 응용 배포·제어 계획 생성</w:t>
       </w:r>
     </w:p>
     <w:p>
@@ -139,7 +152,7 @@
         </w:numPr>
       </w:pPr>
       <w:r>
-        <w:t xml:space="preserve">mock 배포 dry-run 및 서비스 운영 준비도 보고</w:t>
+        <w:t xml:space="preserve">로컬 환경에서 반복 가능한 검증 결과 생성</w:t>
       </w:r>
     </w:p>
     <w:p>
@@ -147,7 +160,7 @@
         <w:pStyle w:val="FirstParagraph"/>
       </w:pPr>
       <w:r>
-        <w:t xml:space="preserve">기본 검증 경로의 제외 범위는 다음과 같습니다.</w:t>
+        <w:t xml:space="preserve">기본 요구 범위에서 제외되는 항목은 다음과 같습니다.</w:t>
       </w:r>
     </w:p>
     <w:p>
@@ -159,7 +172,7 @@
         </w:numPr>
       </w:pPr>
       <w:r>
-        <w:t xml:space="preserve">운영 환경용 완성형 AIOps 운영</w:t>
+        <w:t xml:space="preserve">운영 환경용 완성형 AIOps platform 구축</w:t>
       </w:r>
     </w:p>
     <w:p>
@@ -171,7 +184,7 @@
         </w:numPr>
       </w:pPr>
       <w:r>
-        <w:t xml:space="preserve">최종 표준 LLM 벤치마크 보고</w:t>
+        <w:t xml:space="preserve">최종 표준 LLM benchmark 결과 산출</w:t>
       </w:r>
     </w:p>
     <w:p>
@@ -183,7 +196,7 @@
         </w:numPr>
       </w:pPr>
       <w:r>
-        <w:t xml:space="preserve">실제 GPU VM 프로비저닝</w:t>
+        <w:t xml:space="preserve">실제 GPU VM provisioning 직접 수행</w:t>
       </w:r>
     </w:p>
     <w:p>
@@ -195,7 +208,7 @@
         </w:numPr>
       </w:pPr>
       <w:r>
-        <w:t xml:space="preserve">기본값 기준 live Kubernetes 변경</w:t>
+        <w:t xml:space="preserve">기본 실행 경로에서 live Kubernetes cluster 변경</w:t>
       </w:r>
     </w:p>
     <w:p>
@@ -207,7 +220,7 @@
         </w:numPr>
       </w:pPr>
       <w:r>
-        <w:t xml:space="preserve">CB-Tumblebug 또는 AI-Infra 프로비저닝 구성요소 대체</w:t>
+        <w:t xml:space="preserve">CB-Tumblebug 또는 AI-Infra provisioning component 대체</w:t>
       </w:r>
     </w:p>
     <w:bookmarkEnd w:id="10"/>
@@ -218,618 +231,6 @@
       </w:pPr>
       <w:r>
         <w:t xml:space="preserve">3. 기능 요구사항</w:t>
-      </w:r>
-    </w:p>
-    <w:tbl>
-      <w:tblPr>
-        <w:tblStyle w:val="Table"/>
-        <w:tblW w:type="pct" w:w="5000"/>
-        <w:tblLayout w:type="fixed"/>
-        <w:tblLook w:firstRow="1" w:lastRow="0" w:firstColumn="0" w:lastColumn="0" w:noHBand="0" w:noVBand="0" w:val="0020"/>
-      </w:tblPr>
-      <w:tblGrid>
-        <w:gridCol w:w="2640"/>
-        <w:gridCol w:w="2640"/>
-        <w:gridCol w:w="2640"/>
-      </w:tblGrid>
-      <w:tr>
-        <w:trPr>
-          <w:tblHeader w:val="on"/>
-        </w:trPr>
-        <w:tc>
-          <w:tcPr/>
-          <w:p>
-            <w:pPr>
-              <w:pStyle w:val="Compact"/>
-            </w:pPr>
-            <w:r>
-              <w:t xml:space="preserve">ID</w:t>
-            </w:r>
-          </w:p>
-        </w:tc>
-        <w:tc>
-          <w:tcPr/>
-          <w:p>
-            <w:pPr>
-              <w:pStyle w:val="Compact"/>
-            </w:pPr>
-            <w:r>
-              <w:t xml:space="preserve">기능 요구사항</w:t>
-            </w:r>
-          </w:p>
-        </w:tc>
-        <w:tc>
-          <w:tcPr/>
-          <w:p>
-            <w:pPr>
-              <w:pStyle w:val="Compact"/>
-            </w:pPr>
-            <w:r>
-              <w:t xml:space="preserve">구현 상태</w:t>
-            </w:r>
-          </w:p>
-        </w:tc>
-      </w:tr>
-      <w:tr>
-        <w:tc>
-          <w:tcPr/>
-          <w:p>
-            <w:pPr>
-              <w:pStyle w:val="Compact"/>
-            </w:pPr>
-            <w:r>
-              <w:t xml:space="preserve">FR-01</w:t>
-            </w:r>
-          </w:p>
-        </w:tc>
-        <w:tc>
-          <w:tcPr/>
-          <w:p>
-            <w:pPr>
-              <w:pStyle w:val="Compact"/>
-            </w:pPr>
-            <w:r>
-              <w:t xml:space="preserve">JSON으로 정의한 candidate role과 policy weight를 기반으로 Ops LLM 선정 정책 프로토타입을 제공해야 한다.</w:t>
-            </w:r>
-          </w:p>
-        </w:tc>
-        <w:tc>
-          <w:tcPr/>
-          <w:p>
-            <w:pPr>
-              <w:pStyle w:val="Compact"/>
-            </w:pPr>
-            <w:r>
-              <w:t xml:space="preserve">구현</w:t>
-            </w:r>
-          </w:p>
-        </w:tc>
-      </w:tr>
-      <w:tr>
-        <w:tc>
-          <w:tcPr/>
-          <w:p>
-            <w:pPr>
-              <w:pStyle w:val="Compact"/>
-            </w:pPr>
-            <w:r>
-              <w:t xml:space="preserve">FR-02</w:t>
-            </w:r>
-          </w:p>
-        </w:tc>
-        <w:tc>
-          <w:tcPr/>
-          <w:p>
-            <w:pPr>
-              <w:pStyle w:val="Compact"/>
-            </w:pPr>
-            <w:r>
-              <w:t xml:space="preserve">정책 기반 LLM 후보 ranking을 Go API/CLI 명령으로 제공해야 한다.</w:t>
-            </w:r>
-          </w:p>
-        </w:tc>
-        <w:tc>
-          <w:tcPr/>
-          <w:p>
-            <w:pPr>
-              <w:pStyle w:val="Compact"/>
-            </w:pPr>
-            <w:r>
-              <w:t xml:space="preserve">구현</w:t>
-            </w:r>
-          </w:p>
-        </w:tc>
-      </w:tr>
-      <w:tr>
-        <w:tc>
-          <w:tcPr/>
-          <w:p>
-            <w:pPr>
-              <w:pStyle w:val="Compact"/>
-            </w:pPr>
-            <w:r>
-              <w:t xml:space="preserve">FR-03</w:t>
-            </w:r>
-          </w:p>
-        </w:tc>
-        <w:tc>
-          <w:tcPr/>
-          <w:p>
-            <w:pPr>
-              <w:pStyle w:val="Compact"/>
-            </w:pPr>
-            <w:r>
-              <w:t xml:space="preserve">에이전트 registry 조회, 단일 에이전트 확인, bounded action 검증을 제공해야 한다.</w:t>
-            </w:r>
-          </w:p>
-        </w:tc>
-        <w:tc>
-          <w:tcPr/>
-          <w:p>
-            <w:pPr>
-              <w:pStyle w:val="Compact"/>
-            </w:pPr>
-            <w:r>
-              <w:t xml:space="preserve">구현</w:t>
-            </w:r>
-          </w:p>
-        </w:tc>
-      </w:tr>
-      <w:tr>
-        <w:tc>
-          <w:tcPr/>
-          <w:p>
-            <w:pPr>
-              <w:pStyle w:val="Compact"/>
-            </w:pPr>
-            <w:r>
-              <w:t xml:space="preserve">FR-04</w:t>
-            </w:r>
-          </w:p>
-        </w:tc>
-        <w:tc>
-          <w:tcPr/>
-          <w:p>
-            <w:pPr>
-              <w:pStyle w:val="Compact"/>
-            </w:pPr>
-            <w:r>
-              <w:t xml:space="preserve">accelerator 요구, SLO, 처리량, 비용, capacity를 기준으로 CPU/GPU VM 배치를 추천해야 한다.</w:t>
-            </w:r>
-          </w:p>
-        </w:tc>
-        <w:tc>
-          <w:tcPr/>
-          <w:p>
-            <w:pPr>
-              <w:pStyle w:val="Compact"/>
-            </w:pPr>
-            <w:r>
-              <w:t xml:space="preserve">구현</w:t>
-            </w:r>
-          </w:p>
-        </w:tc>
-      </w:tr>
-      <w:tr>
-        <w:tc>
-          <w:tcPr/>
-          <w:p>
-            <w:pPr>
-              <w:pStyle w:val="Compact"/>
-            </w:pPr>
-            <w:r>
-              <w:t xml:space="preserve">FR-05</w:t>
-            </w:r>
-          </w:p>
-        </w:tc>
-        <w:tc>
-          <w:tcPr/>
-          <w:p>
-            <w:pPr>
-              <w:pStyle w:val="Compact"/>
-            </w:pPr>
-            <w:r>
-              <w:t xml:space="preserve">선택된 AI 응용 자원에 대한 Kubernetes 배포·제어 계획을 생성해야 한다.</w:t>
-            </w:r>
-          </w:p>
-        </w:tc>
-        <w:tc>
-          <w:tcPr/>
-          <w:p>
-            <w:pPr>
-              <w:pStyle w:val="Compact"/>
-            </w:pPr>
-            <w:r>
-              <w:t xml:space="preserve">구현</w:t>
-            </w:r>
-          </w:p>
-        </w:tc>
-      </w:tr>
-      <w:tr>
-        <w:tc>
-          <w:tcPr/>
-          <w:p>
-            <w:pPr>
-              <w:pStyle w:val="Compact"/>
-            </w:pPr>
-            <w:r>
-              <w:t xml:space="preserve">FR-06</w:t>
-            </w:r>
-          </w:p>
-        </w:tc>
-        <w:tc>
-          <w:tcPr/>
-          <w:p>
-            <w:pPr>
-              <w:pStyle w:val="Compact"/>
-            </w:pPr>
-            <w:r>
-              <w:t xml:space="preserve">LLM 선정, 배치 추천, 배포 계획 생성, 에이전트 검토, mock dry-run, guard 준비도 검증을 결합한 통합 서비스 운영 준비도 보고서를 생성해야 한다.</w:t>
-            </w:r>
-          </w:p>
-        </w:tc>
-        <w:tc>
-          <w:tcPr/>
-          <w:p>
-            <w:pPr>
-              <w:pStyle w:val="Compact"/>
-            </w:pPr>
-            <w:r>
-              <w:t xml:space="preserve">구현</w:t>
-            </w:r>
-          </w:p>
-        </w:tc>
-      </w:tr>
-      <w:tr>
-        <w:tc>
-          <w:tcPr/>
-          <w:p>
-            <w:pPr>
-              <w:pStyle w:val="Compact"/>
-            </w:pPr>
-            <w:r>
-              <w:t xml:space="preserve">FR-07</w:t>
-            </w:r>
-          </w:p>
-        </w:tc>
-        <w:tc>
-          <w:tcPr/>
-          <w:p>
-            <w:pPr>
-              <w:pStyle w:val="Compact"/>
-            </w:pPr>
-            <w:r>
-              <w:t xml:space="preserve">주요 기능을 Echo 기반 Go HTTP API로 제공해야 한다.</w:t>
-            </w:r>
-          </w:p>
-        </w:tc>
-        <w:tc>
-          <w:tcPr/>
-          <w:p>
-            <w:pPr>
-              <w:pStyle w:val="Compact"/>
-            </w:pPr>
-            <w:r>
-              <w:t xml:space="preserve">구현</w:t>
-            </w:r>
-          </w:p>
-        </w:tc>
-      </w:tr>
-      <w:tr>
-        <w:tc>
-          <w:tcPr/>
-          <w:p>
-            <w:pPr>
-              <w:pStyle w:val="Compact"/>
-            </w:pPr>
-            <w:r>
-              <w:t xml:space="preserve">FR-08</w:t>
-            </w:r>
-          </w:p>
-        </w:tc>
-        <w:tc>
-          <w:tcPr/>
-          <w:p>
-            <w:pPr>
-              <w:pStyle w:val="Compact"/>
-            </w:pPr>
-            <w:r>
-              <w:t xml:space="preserve">서비스 제어 API의 OpenAPI 계약을 제공해야 한다.</w:t>
-            </w:r>
-          </w:p>
-        </w:tc>
-        <w:tc>
-          <w:tcPr/>
-          <w:p>
-            <w:pPr>
-              <w:pStyle w:val="Compact"/>
-            </w:pPr>
-            <w:r>
-              <w:t xml:space="preserve">구현</w:t>
-            </w:r>
-          </w:p>
-        </w:tc>
-      </w:tr>
-    </w:tbl>
-    <w:bookmarkEnd w:id="11"/>
-    <w:bookmarkStart w:id="12" w:name="비기능-요구사항"/>
-    <w:p>
-      <w:pPr>
-        <w:pStyle w:val="Heading2"/>
-      </w:pPr>
-      <w:r>
-        <w:t xml:space="preserve">4. 비기능 요구사항</w:t>
-      </w:r>
-    </w:p>
-    <w:tbl>
-      <w:tblPr>
-        <w:tblStyle w:val="Table"/>
-        <w:tblW w:type="pct" w:w="5000"/>
-        <w:tblLayout w:type="fixed"/>
-        <w:tblLook w:firstRow="1" w:lastRow="0" w:firstColumn="0" w:lastColumn="0" w:noHBand="0" w:noVBand="0" w:val="0020"/>
-      </w:tblPr>
-      <w:tblGrid>
-        <w:gridCol w:w="2640"/>
-        <w:gridCol w:w="2640"/>
-        <w:gridCol w:w="2640"/>
-      </w:tblGrid>
-      <w:tr>
-        <w:trPr>
-          <w:tblHeader w:val="on"/>
-        </w:trPr>
-        <w:tc>
-          <w:tcPr/>
-          <w:p>
-            <w:pPr>
-              <w:pStyle w:val="Compact"/>
-            </w:pPr>
-            <w:r>
-              <w:t xml:space="preserve">ID</w:t>
-            </w:r>
-          </w:p>
-        </w:tc>
-        <w:tc>
-          <w:tcPr/>
-          <w:p>
-            <w:pPr>
-              <w:pStyle w:val="Compact"/>
-            </w:pPr>
-            <w:r>
-              <w:t xml:space="preserve">비기능 요구사항</w:t>
-            </w:r>
-          </w:p>
-        </w:tc>
-        <w:tc>
-          <w:tcPr/>
-          <w:p>
-            <w:pPr>
-              <w:pStyle w:val="Compact"/>
-            </w:pPr>
-            <w:r>
-              <w:t xml:space="preserve">근거</w:t>
-            </w:r>
-          </w:p>
-        </w:tc>
-      </w:tr>
-      <w:tr>
-        <w:tc>
-          <w:tcPr/>
-          <w:p>
-            <w:pPr>
-              <w:pStyle w:val="Compact"/>
-            </w:pPr>
-            <w:r>
-              <w:t xml:space="preserve">NFR-01</w:t>
-            </w:r>
-          </w:p>
-        </w:tc>
-        <w:tc>
-          <w:tcPr/>
-          <w:p>
-            <w:pPr>
-              <w:pStyle w:val="Compact"/>
-            </w:pPr>
-            <w:r>
-              <w:t xml:space="preserve">제출/시연 경로의 구현은 Go 중심으로 유지해야 한다.</w:t>
-            </w:r>
-          </w:p>
-        </w:tc>
-        <w:tc>
-          <w:tcPr/>
-          <w:p>
-            <w:pPr>
-              <w:pStyle w:val="Compact"/>
-            </w:pPr>
-            <w:r>
-              <w:t xml:space="preserve">개발 언어 요구사항에 맞추고 혼합 언어 프로토타입의 모호성을 줄인다.</w:t>
-            </w:r>
-          </w:p>
-        </w:tc>
-      </w:tr>
-      <w:tr>
-        <w:tc>
-          <w:tcPr/>
-          <w:p>
-            <w:pPr>
-              <w:pStyle w:val="Compact"/>
-            </w:pPr>
-            <w:r>
-              <w:t xml:space="preserve">NFR-02</w:t>
-            </w:r>
-          </w:p>
-        </w:tc>
-        <w:tc>
-          <w:tcPr/>
-          <w:p>
-            <w:pPr>
-              <w:pStyle w:val="Compact"/>
-            </w:pPr>
-            <w:r>
-              <w:t xml:space="preserve">LLM, 에이전트, 배치 정책은 JSON 설정으로 재현 가능해야 한다.</w:t>
-            </w:r>
-          </w:p>
-        </w:tc>
-        <w:tc>
-          <w:tcPr/>
-          <w:p>
-            <w:pPr>
-              <w:pStyle w:val="Compact"/>
-            </w:pPr>
-            <w:r>
-              <w:t xml:space="preserve">검토 가능하고 반복 가능한 기능 검증을 지원한다.</w:t>
-            </w:r>
-          </w:p>
-        </w:tc>
-      </w:tr>
-      <w:tr>
-        <w:tc>
-          <w:tcPr/>
-          <w:p>
-            <w:pPr>
-              <w:pStyle w:val="Compact"/>
-            </w:pPr>
-            <w:r>
-              <w:t xml:space="preserve">NFR-03</w:t>
-            </w:r>
-          </w:p>
-        </w:tc>
-        <w:tc>
-          <w:tcPr/>
-          <w:p>
-            <w:pPr>
-              <w:pStyle w:val="Compact"/>
-            </w:pPr>
-            <w:r>
-              <w:t xml:space="preserve">기본 실행 경로는 mock 검증을 사용해야 한다.</w:t>
-            </w:r>
-          </w:p>
-        </w:tc>
-        <w:tc>
-          <w:tcPr/>
-          <w:p>
-            <w:pPr>
-              <w:pStyle w:val="Compact"/>
-            </w:pPr>
-            <w:r>
-              <w:t xml:space="preserve">live Kubernetes 또는 GPU VM 인프라 없이 로컬 검증을 가능하게 한다.</w:t>
-            </w:r>
-          </w:p>
-        </w:tc>
-      </w:tr>
-      <w:tr>
-        <w:tc>
-          <w:tcPr/>
-          <w:p>
-            <w:pPr>
-              <w:pStyle w:val="Compact"/>
-            </w:pPr>
-            <w:r>
-              <w:t xml:space="preserve">NFR-04</w:t>
-            </w:r>
-          </w:p>
-        </w:tc>
-        <w:tc>
-          <w:tcPr/>
-          <w:p>
-            <w:pPr>
-              <w:pStyle w:val="Compact"/>
-            </w:pPr>
-            <w:r>
-              <w:t xml:space="preserve">프로토타입 검증과 운영 환경 배포를 명확히 구분해야 한다.</w:t>
-            </w:r>
-          </w:p>
-        </w:tc>
-        <w:tc>
-          <w:tcPr/>
-          <w:p>
-            <w:pPr>
-              <w:pStyle w:val="Compact"/>
-            </w:pPr>
-            <w:r>
-              <w:t xml:space="preserve">기능 프로토타입이 운영 시스템으로 오해되는 것을 방지한다.</w:t>
-            </w:r>
-          </w:p>
-        </w:tc>
-      </w:tr>
-      <w:tr>
-        <w:tc>
-          <w:tcPr/>
-          <w:p>
-            <w:pPr>
-              <w:pStyle w:val="Compact"/>
-            </w:pPr>
-            <w:r>
-              <w:t xml:space="preserve">NFR-05</w:t>
-            </w:r>
-          </w:p>
-        </w:tc>
-        <w:tc>
-          <w:tcPr/>
-          <w:p>
-            <w:pPr>
-              <w:pStyle w:val="Compact"/>
-            </w:pPr>
-            <w:r>
-              <w:t xml:space="preserve">프로토타입 정책 기준값과 최종 벤치마크 결과를 명확히 구분해야 한다.</w:t>
-            </w:r>
-          </w:p>
-        </w:tc>
-        <w:tc>
-          <w:tcPr/>
-          <w:p>
-            <w:pPr>
-              <w:pStyle w:val="Compact"/>
-            </w:pPr>
-            <w:r>
-              <w:t xml:space="preserve">수동 정의 LLM 정책 값이 표준 모델 평가 결과로 해석되는 것을 방지한다.</w:t>
-            </w:r>
-          </w:p>
-        </w:tc>
-      </w:tr>
-      <w:tr>
-        <w:tc>
-          <w:tcPr/>
-          <w:p>
-            <w:pPr>
-              <w:pStyle w:val="Compact"/>
-            </w:pPr>
-            <w:r>
-              <w:t xml:space="preserve">NFR-06</w:t>
-            </w:r>
-          </w:p>
-        </w:tc>
-        <w:tc>
-          <w:tcPr/>
-          <w:p>
-            <w:pPr>
-              <w:pStyle w:val="Compact"/>
-            </w:pPr>
-            <w:r>
-              <w:t xml:space="preserve">불필요한 외부 의존성과 핵심 범위 밖 실험 runner를 제거해야 한다.</w:t>
-            </w:r>
-          </w:p>
-        </w:tc>
-        <w:tc>
-          <w:tcPr/>
-          <w:p>
-            <w:pPr>
-              <w:pStyle w:val="Compact"/>
-            </w:pPr>
-            <w:r>
-              <w:t xml:space="preserve">담당 연구 산출물 중심으로 저장소를 유지한다.</w:t>
-            </w:r>
-          </w:p>
-        </w:tc>
-      </w:tr>
-    </w:tbl>
-    <w:bookmarkEnd w:id="12"/>
-    <w:bookmarkStart w:id="13" w:name="제출-산출물-요구사항"/>
-    <w:p>
-      <w:pPr>
-        <w:pStyle w:val="Heading2"/>
-      </w:pPr>
-      <w:r>
-        <w:t xml:space="preserve">5. 제출 산출물 요구사항</w:t>
       </w:r>
     </w:p>
     <w:tbl>
@@ -856,29 +257,7 @@
               <w:pStyle w:val="Compact"/>
             </w:pPr>
             <w:r>
-              <w:t xml:space="preserve">필수 산출물</w:t>
-            </w:r>
-          </w:p>
-        </w:tc>
-        <w:tc>
-          <w:tcPr/>
-          <w:p>
-            <w:pPr>
-              <w:pStyle w:val="Compact"/>
-            </w:pPr>
-            <w:r>
-              <w:t xml:space="preserve">형식</w:t>
-            </w:r>
-          </w:p>
-        </w:tc>
-        <w:tc>
-          <w:tcPr/>
-          <w:p>
-            <w:pPr>
-              <w:pStyle w:val="Compact"/>
-            </w:pPr>
-            <w:r>
-              <w:t xml:space="preserve">저장소 경로</w:t>
+              <w:t xml:space="preserve">ID</w:t>
             </w:r>
           </w:p>
         </w:tc>
@@ -890,6 +269,28 @@
             </w:pPr>
             <w:r>
               <w:t xml:space="preserve">요구사항</w:t>
+            </w:r>
+          </w:p>
+        </w:tc>
+        <w:tc>
+          <w:tcPr/>
+          <w:p>
+            <w:pPr>
+              <w:pStyle w:val="Compact"/>
+            </w:pPr>
+            <w:r>
+              <w:t xml:space="preserve">우선순위</w:t>
+            </w:r>
+          </w:p>
+        </w:tc>
+        <w:tc>
+          <w:tcPr/>
+          <w:p>
+            <w:pPr>
+              <w:pStyle w:val="Compact"/>
+            </w:pPr>
+            <w:r>
+              <w:t xml:space="preserve">수용 기준</w:t>
             </w:r>
           </w:p>
         </w:tc>
@@ -902,43 +303,40 @@
               <w:pStyle w:val="Compact"/>
             </w:pPr>
             <w:r>
-              <w:t xml:space="preserve">요구사항 정의서 원본</w:t>
-            </w:r>
-          </w:p>
-        </w:tc>
-        <w:tc>
-          <w:tcPr/>
-          <w:p>
-            <w:pPr>
-              <w:pStyle w:val="Compact"/>
-            </w:pPr>
-            <w:r>
-              <w:t xml:space="preserve">Markdown</w:t>
-            </w:r>
-          </w:p>
-        </w:tc>
-        <w:tc>
-          <w:tcPr/>
-          <w:p>
-            <w:pPr>
-              <w:pStyle w:val="Compact"/>
-            </w:pPr>
-            <w:r>
-              <w:rPr>
-                <w:rStyle w:val="VerbatimChar"/>
-              </w:rPr>
-              <w:t xml:space="preserve">docs/submission/requirements_definition.md</w:t>
-            </w:r>
-          </w:p>
-        </w:tc>
-        <w:tc>
-          <w:tcPr/>
-          <w:p>
-            <w:pPr>
-              <w:pStyle w:val="Compact"/>
-            </w:pPr>
-            <w:r>
-              <w:t xml:space="preserve">범위, 요구사항, 검증 방법, 경계 조건을 정의해야 한다.</w:t>
+              <w:t xml:space="preserve">FR-01</w:t>
+            </w:r>
+          </w:p>
+        </w:tc>
+        <w:tc>
+          <w:tcPr/>
+          <w:p>
+            <w:pPr>
+              <w:pStyle w:val="Compact"/>
+            </w:pPr>
+            <w:r>
+              <w:t xml:space="preserve">시스템은 Ops 분석 시험을 위해 LLM 후보, 평가 기준, 선정 policy를 정의할 수 있어야 한다.</w:t>
+            </w:r>
+          </w:p>
+        </w:tc>
+        <w:tc>
+          <w:tcPr/>
+          <w:p>
+            <w:pPr>
+              <w:pStyle w:val="Compact"/>
+            </w:pPr>
+            <w:r>
+              <w:t xml:space="preserve">필수</w:t>
+            </w:r>
+          </w:p>
+        </w:tc>
+        <w:tc>
+          <w:tcPr/>
+          <w:p>
+            <w:pPr>
+              <w:pStyle w:val="Compact"/>
+            </w:pPr>
+            <w:r>
+              <w:t xml:space="preserve">LLM 후보와 policy weight가 검토 가능한 설정으로 분리되고, 요청 policy에 따라 후보 ranking과 선정 결과를 산출할 수 있어야 한다.</w:t>
             </w:r>
           </w:p>
         </w:tc>
@@ -951,43 +349,40 @@
               <w:pStyle w:val="Compact"/>
             </w:pPr>
             <w:r>
-              <w:t xml:space="preserve">요구사항 정의서 제출본</w:t>
-            </w:r>
-          </w:p>
-        </w:tc>
-        <w:tc>
-          <w:tcPr/>
-          <w:p>
-            <w:pPr>
-              <w:pStyle w:val="Compact"/>
-            </w:pPr>
-            <w:r>
-              <w:t xml:space="preserve">DOCX</w:t>
-            </w:r>
-          </w:p>
-        </w:tc>
-        <w:tc>
-          <w:tcPr/>
-          <w:p>
-            <w:pPr>
-              <w:pStyle w:val="Compact"/>
-            </w:pPr>
-            <w:r>
-              <w:rPr>
-                <w:rStyle w:val="VerbatimChar"/>
-              </w:rPr>
-              <w:t xml:space="preserve">docs/submission/requirements_definition.docx</w:t>
-            </w:r>
-          </w:p>
-        </w:tc>
-        <w:tc>
-          <w:tcPr/>
-          <w:p>
-            <w:pPr>
-              <w:pStyle w:val="Compact"/>
-            </w:pPr>
-            <w:r>
-              <w:t xml:space="preserve">Markdown 원본을 기준으로 생성되어야 한다.</w:t>
+              <w:t xml:space="preserve">FR-02</w:t>
+            </w:r>
+          </w:p>
+        </w:tc>
+        <w:tc>
+          <w:tcPr/>
+          <w:p>
+            <w:pPr>
+              <w:pStyle w:val="Compact"/>
+            </w:pPr>
+            <w:r>
+              <w:t xml:space="preserve">시스템은 선정된 LLM 후보가 AI LLM 운영 관리 흐름에서 어떤 역할을 수행하는지 설명 가능한 구조를 가져야 한다.</w:t>
+            </w:r>
+          </w:p>
+        </w:tc>
+        <w:tc>
+          <w:tcPr/>
+          <w:p>
+            <w:pPr>
+              <w:pStyle w:val="Compact"/>
+            </w:pPr>
+            <w:r>
+              <w:t xml:space="preserve">필수</w:t>
+            </w:r>
+          </w:p>
+        </w:tc>
+        <w:tc>
+          <w:tcPr/>
+          <w:p>
+            <w:pPr>
+              <w:pStyle w:val="Compact"/>
+            </w:pPr>
+            <w:r>
+              <w:t xml:space="preserve">선정 결과에는 candidate label, 점수, ranking, 선정 사유가 포함되어야 하며, 최종 benchmark 결과와 prototype 기준값을 구분해야 한다.</w:t>
             </w:r>
           </w:p>
         </w:tc>
@@ -1000,43 +395,40 @@
               <w:pStyle w:val="Compact"/>
             </w:pPr>
             <w:r>
-              <w:t xml:space="preserve">기능/API 가이드</w:t>
-            </w:r>
-          </w:p>
-        </w:tc>
-        <w:tc>
-          <w:tcPr/>
-          <w:p>
-            <w:pPr>
-              <w:pStyle w:val="Compact"/>
-            </w:pPr>
-            <w:r>
-              <w:t xml:space="preserve">Markdown</w:t>
-            </w:r>
-          </w:p>
-        </w:tc>
-        <w:tc>
-          <w:tcPr/>
-          <w:p>
-            <w:pPr>
-              <w:pStyle w:val="Compact"/>
-            </w:pPr>
-            <w:r>
-              <w:rPr>
-                <w:rStyle w:val="VerbatimChar"/>
-              </w:rPr>
-              <w:t xml:space="preserve">docs/submission/functional_api_guide.md</w:t>
-            </w:r>
-          </w:p>
-        </w:tc>
-        <w:tc>
-          <w:tcPr/>
-          <w:p>
-            <w:pPr>
-              <w:pStyle w:val="Compact"/>
-            </w:pPr>
-            <w:r>
-              <w:t xml:space="preserve">API 서버 실행, endpoint, request 예시, response 필드를 설명해야 한다.</w:t>
+              <w:t xml:space="preserve">FR-03</w:t>
+            </w:r>
+          </w:p>
+        </w:tc>
+        <w:tc>
+          <w:tcPr/>
+          <w:p>
+            <w:pPr>
+              <w:pStyle w:val="Compact"/>
+            </w:pPr>
+            <w:r>
+              <w:t xml:space="preserve">시스템은 AI 에이전트를 등록하고, 각 에이전트의 역할·책임·허용 action을 관리할 수 있어야 한다.</w:t>
+            </w:r>
+          </w:p>
+        </w:tc>
+        <w:tc>
+          <w:tcPr/>
+          <w:p>
+            <w:pPr>
+              <w:pStyle w:val="Compact"/>
+            </w:pPr>
+            <w:r>
+              <w:t xml:space="preserve">필수</w:t>
+            </w:r>
+          </w:p>
+        </w:tc>
+        <w:tc>
+          <w:tcPr/>
+          <w:p>
+            <w:pPr>
+              <w:pStyle w:val="Compact"/>
+            </w:pPr>
+            <w:r>
+              <w:t xml:space="preserve">에이전트 목록 조회, 단일 에이전트 확인, 허용 action 검증이 가능해야 한다.</w:t>
             </w:r>
           </w:p>
         </w:tc>
@@ -1049,43 +441,40 @@
               <w:pStyle w:val="Compact"/>
             </w:pPr>
             <w:r>
-              <w:t xml:space="preserve">Swagger/OpenAPI</w:t>
-            </w:r>
-          </w:p>
-        </w:tc>
-        <w:tc>
-          <w:tcPr/>
-          <w:p>
-            <w:pPr>
-              <w:pStyle w:val="Compact"/>
-            </w:pPr>
-            <w:r>
-              <w:t xml:space="preserve">YAML</w:t>
-            </w:r>
-          </w:p>
-        </w:tc>
-        <w:tc>
-          <w:tcPr/>
-          <w:p>
-            <w:pPr>
-              <w:pStyle w:val="Compact"/>
-            </w:pPr>
-            <w:r>
-              <w:rPr>
-                <w:rStyle w:val="VerbatimChar"/>
-              </w:rPr>
-              <w:t xml:space="preserve">docs/submission/openapi_service_control.yaml</w:t>
-            </w:r>
-          </w:p>
-        </w:tc>
-        <w:tc>
-          <w:tcPr/>
-          <w:p>
-            <w:pPr>
-              <w:pStyle w:val="Compact"/>
-            </w:pPr>
-            <w:r>
-              <w:t xml:space="preserve">HTTP API 계약을 설명해야 한다.</w:t>
+              <w:t xml:space="preserve">FR-04</w:t>
+            </w:r>
+          </w:p>
+        </w:tc>
+        <w:tc>
+          <w:tcPr/>
+          <w:p>
+            <w:pPr>
+              <w:pStyle w:val="Compact"/>
+            </w:pPr>
+            <w:r>
+              <w:t xml:space="preserve">시스템은 에이전트가 제안하거나 승인하는 action이 사전에 정의된 boundary 안에 있는지 검증해야 한다.</w:t>
+            </w:r>
+          </w:p>
+        </w:tc>
+        <w:tc>
+          <w:tcPr/>
+          <w:p>
+            <w:pPr>
+              <w:pStyle w:val="Compact"/>
+            </w:pPr>
+            <w:r>
+              <w:t xml:space="preserve">필수</w:t>
+            </w:r>
+          </w:p>
+        </w:tc>
+        <w:tc>
+          <w:tcPr/>
+          <w:p>
+            <w:pPr>
+              <w:pStyle w:val="Compact"/>
+            </w:pPr>
+            <w:r>
+              <w:t xml:space="preserve">허용되지 않은 action은 ready 상태로 처리되지 않아야 하며, 검증 결과에는 승인 여부와 사유가 포함되어야 한다.</w:t>
             </w:r>
           </w:p>
         </w:tc>
@@ -1098,43 +487,40 @@
               <w:pStyle w:val="Compact"/>
             </w:pPr>
             <w:r>
-              <w:t xml:space="preserve">설치 및 실행 가이드</w:t>
-            </w:r>
-          </w:p>
-        </w:tc>
-        <w:tc>
-          <w:tcPr/>
-          <w:p>
-            <w:pPr>
-              <w:pStyle w:val="Compact"/>
-            </w:pPr>
-            <w:r>
-              <w:t xml:space="preserve">Markdown</w:t>
-            </w:r>
-          </w:p>
-        </w:tc>
-        <w:tc>
-          <w:tcPr/>
-          <w:p>
-            <w:pPr>
-              <w:pStyle w:val="Compact"/>
-            </w:pPr>
-            <w:r>
-              <w:rPr>
-                <w:rStyle w:val="VerbatimChar"/>
-              </w:rPr>
-              <w:t xml:space="preserve">docs/submission/install_and_run_guide.md</w:t>
-            </w:r>
-          </w:p>
-        </w:tc>
-        <w:tc>
-          <w:tcPr/>
-          <w:p>
-            <w:pPr>
-              <w:pStyle w:val="Compact"/>
-            </w:pPr>
-            <w:r>
-              <w:t xml:space="preserve">Go 설정, CLI 실행, API 실행, mock mode, 기대 출력을 설명해야 한다.</w:t>
+              <w:t xml:space="preserve">FR-05</w:t>
+            </w:r>
+          </w:p>
+        </w:tc>
+        <w:tc>
+          <w:tcPr/>
+          <w:p>
+            <w:pPr>
+              <w:pStyle w:val="Compact"/>
+            </w:pPr>
+            <w:r>
+              <w:t xml:space="preserve">시스템은 AI workload 요구사항을 기준으로 CPU/GPU VM resource 후보를 평가할 수 있어야 한다.</w:t>
+            </w:r>
+          </w:p>
+        </w:tc>
+        <w:tc>
+          <w:tcPr/>
+          <w:p>
+            <w:pPr>
+              <w:pStyle w:val="Compact"/>
+            </w:pPr>
+            <w:r>
+              <w:t xml:space="preserve">필수</w:t>
+            </w:r>
+          </w:p>
+        </w:tc>
+        <w:tc>
+          <w:tcPr/>
+          <w:p>
+            <w:pPr>
+              <w:pStyle w:val="Compact"/>
+            </w:pPr>
+            <w:r>
+              <w:t xml:space="preserve">accelerator 필요 여부, model type, VRAM, latency SLO, throughput, cost, capacity를 판단 기준으로 사용할 수 있어야 한다.</w:t>
             </w:r>
           </w:p>
         </w:tc>
@@ -1147,6 +533,662 @@
               <w:pStyle w:val="Compact"/>
             </w:pPr>
             <w:r>
+              <w:t xml:space="preserve">FR-06</w:t>
+            </w:r>
+          </w:p>
+        </w:tc>
+        <w:tc>
+          <w:tcPr/>
+          <w:p>
+            <w:pPr>
+              <w:pStyle w:val="Compact"/>
+            </w:pPr>
+            <w:r>
+              <w:t xml:space="preserve">시스템은 AI 응용 배포·제어를 위한 resource 선택 결과와 배포 계획을 생성할 수 있어야 한다.</w:t>
+            </w:r>
+          </w:p>
+        </w:tc>
+        <w:tc>
+          <w:tcPr/>
+          <w:p>
+            <w:pPr>
+              <w:pStyle w:val="Compact"/>
+            </w:pPr>
+            <w:r>
+              <w:t xml:space="preserve">필수</w:t>
+            </w:r>
+          </w:p>
+        </w:tc>
+        <w:tc>
+          <w:tcPr/>
+          <w:p>
+            <w:pPr>
+              <w:pStyle w:val="Compact"/>
+            </w:pPr>
+            <w:r>
+              <w:t xml:space="preserve">선택 resource, 배포 action, Kubernetes namespace/deployment, node selector, resource request/limit, monitoring metric이 포함되어야 한다.</w:t>
+            </w:r>
+          </w:p>
+        </w:tc>
+      </w:tr>
+      <w:tr>
+        <w:tc>
+          <w:tcPr/>
+          <w:p>
+            <w:pPr>
+              <w:pStyle w:val="Compact"/>
+            </w:pPr>
+            <w:r>
+              <w:t xml:space="preserve">FR-07</w:t>
+            </w:r>
+          </w:p>
+        </w:tc>
+        <w:tc>
+          <w:tcPr/>
+          <w:p>
+            <w:pPr>
+              <w:pStyle w:val="Compact"/>
+            </w:pPr>
+            <w:r>
+              <w:t xml:space="preserve">시스템은 LLM 선정, 에이전트 검증, CPU/GPU 배치, 배포 계획, guard 검증을 하나의 서비스 운영 준비도 결과로 통합할 수 있어야 한다.</w:t>
+            </w:r>
+          </w:p>
+        </w:tc>
+        <w:tc>
+          <w:tcPr/>
+          <w:p>
+            <w:pPr>
+              <w:pStyle w:val="Compact"/>
+            </w:pPr>
+            <w:r>
+              <w:t xml:space="preserve">필수</w:t>
+            </w:r>
+          </w:p>
+        </w:tc>
+        <w:tc>
+          <w:tcPr/>
+          <w:p>
+            <w:pPr>
+              <w:pStyle w:val="Compact"/>
+            </w:pPr>
+            <w:r>
+              <w:t xml:space="preserve">통합 결과에는 전체 valid 여부와 단계별 판단 결과가 포함되어야 한다.</w:t>
+            </w:r>
+          </w:p>
+        </w:tc>
+      </w:tr>
+      <w:tr>
+        <w:tc>
+          <w:tcPr/>
+          <w:p>
+            <w:pPr>
+              <w:pStyle w:val="Compact"/>
+            </w:pPr>
+            <w:r>
+              <w:t xml:space="preserve">FR-08</w:t>
+            </w:r>
+          </w:p>
+        </w:tc>
+        <w:tc>
+          <w:tcPr/>
+          <w:p>
+            <w:pPr>
+              <w:pStyle w:val="Compact"/>
+            </w:pPr>
+            <w:r>
+              <w:t xml:space="preserve">시스템은 CLI와 HTTP API 양쪽에서 주요 기능을 실행할 수 있어야 한다.</w:t>
+            </w:r>
+          </w:p>
+        </w:tc>
+        <w:tc>
+          <w:tcPr/>
+          <w:p>
+            <w:pPr>
+              <w:pStyle w:val="Compact"/>
+            </w:pPr>
+            <w:r>
+              <w:t xml:space="preserve">필수</w:t>
+            </w:r>
+          </w:p>
+        </w:tc>
+        <w:tc>
+          <w:tcPr/>
+          <w:p>
+            <w:pPr>
+              <w:pStyle w:val="Compact"/>
+            </w:pPr>
+            <w:r>
+              <w:t xml:space="preserve">동일한 핵심 기능을 명령행과 API endpoint로 검증할 수 있어야 한다.</w:t>
+            </w:r>
+          </w:p>
+        </w:tc>
+      </w:tr>
+      <w:tr>
+        <w:tc>
+          <w:tcPr/>
+          <w:p>
+            <w:pPr>
+              <w:pStyle w:val="Compact"/>
+            </w:pPr>
+            <w:r>
+              <w:t xml:space="preserve">FR-09</w:t>
+            </w:r>
+          </w:p>
+        </w:tc>
+        <w:tc>
+          <w:tcPr/>
+          <w:p>
+            <w:pPr>
+              <w:pStyle w:val="Compact"/>
+            </w:pPr>
+            <w:r>
+              <w:t xml:space="preserve">시스템은 API 계약을 외부 검토자가 확인할 수 있는 표준 형식으로 제공해야 한다.</w:t>
+            </w:r>
+          </w:p>
+        </w:tc>
+        <w:tc>
+          <w:tcPr/>
+          <w:p>
+            <w:pPr>
+              <w:pStyle w:val="Compact"/>
+            </w:pPr>
+            <w:r>
+              <w:t xml:space="preserve">필수</w:t>
+            </w:r>
+          </w:p>
+        </w:tc>
+        <w:tc>
+          <w:tcPr/>
+          <w:p>
+            <w:pPr>
+              <w:pStyle w:val="Compact"/>
+            </w:pPr>
+            <w:r>
+              <w:t xml:space="preserve">OpenAPI 또는 Swagger 형식의 API 계약 문서가 제공되어야 한다.</w:t>
+            </w:r>
+          </w:p>
+        </w:tc>
+      </w:tr>
+    </w:tbl>
+    <w:bookmarkEnd w:id="11"/>
+    <w:bookmarkStart w:id="12" w:name="비기능-요구사항"/>
+    <w:p>
+      <w:pPr>
+        <w:pStyle w:val="Heading2"/>
+      </w:pPr>
+      <w:r>
+        <w:t xml:space="preserve">4. 비기능 요구사항</w:t>
+      </w:r>
+    </w:p>
+    <w:tbl>
+      <w:tblPr>
+        <w:tblStyle w:val="Table"/>
+        <w:tblW w:type="pct" w:w="5000"/>
+        <w:tblLayout w:type="fixed"/>
+        <w:tblLook w:firstRow="1" w:lastRow="0" w:firstColumn="0" w:lastColumn="0" w:noHBand="0" w:noVBand="0" w:val="0020"/>
+      </w:tblPr>
+      <w:tblGrid>
+        <w:gridCol w:w="2640"/>
+        <w:gridCol w:w="2640"/>
+        <w:gridCol w:w="2640"/>
+      </w:tblGrid>
+      <w:tr>
+        <w:trPr>
+          <w:tblHeader w:val="on"/>
+        </w:trPr>
+        <w:tc>
+          <w:tcPr/>
+          <w:p>
+            <w:pPr>
+              <w:pStyle w:val="Compact"/>
+            </w:pPr>
+            <w:r>
+              <w:t xml:space="preserve">ID</w:t>
+            </w:r>
+          </w:p>
+        </w:tc>
+        <w:tc>
+          <w:tcPr/>
+          <w:p>
+            <w:pPr>
+              <w:pStyle w:val="Compact"/>
+            </w:pPr>
+            <w:r>
+              <w:t xml:space="preserve">요구사항</w:t>
+            </w:r>
+          </w:p>
+        </w:tc>
+        <w:tc>
+          <w:tcPr/>
+          <w:p>
+            <w:pPr>
+              <w:pStyle w:val="Compact"/>
+            </w:pPr>
+            <w:r>
+              <w:t xml:space="preserve">수용 기준</w:t>
+            </w:r>
+          </w:p>
+        </w:tc>
+      </w:tr>
+      <w:tr>
+        <w:tc>
+          <w:tcPr/>
+          <w:p>
+            <w:pPr>
+              <w:pStyle w:val="Compact"/>
+            </w:pPr>
+            <w:r>
+              <w:t xml:space="preserve">NFR-01</w:t>
+            </w:r>
+          </w:p>
+        </w:tc>
+        <w:tc>
+          <w:tcPr/>
+          <w:p>
+            <w:pPr>
+              <w:pStyle w:val="Compact"/>
+            </w:pPr>
+            <w:r>
+              <w:t xml:space="preserve">제출/시연 경로의 핵심 구현은 Go 언어 중심이어야 한다.</w:t>
+            </w:r>
+          </w:p>
+        </w:tc>
+        <w:tc>
+          <w:tcPr/>
+          <w:p>
+            <w:pPr>
+              <w:pStyle w:val="Compact"/>
+            </w:pPr>
+            <w:r>
+              <w:t xml:space="preserve">핵심 판단 로직과 API/CLI 실행 경로가 Go module 안에 위치해야 한다.</w:t>
+            </w:r>
+          </w:p>
+        </w:tc>
+      </w:tr>
+      <w:tr>
+        <w:tc>
+          <w:tcPr/>
+          <w:p>
+            <w:pPr>
+              <w:pStyle w:val="Compact"/>
+            </w:pPr>
+            <w:r>
+              <w:t xml:space="preserve">NFR-02</w:t>
+            </w:r>
+          </w:p>
+        </w:tc>
+        <w:tc>
+          <w:tcPr/>
+          <w:p>
+            <w:pPr>
+              <w:pStyle w:val="Compact"/>
+            </w:pPr>
+            <w:r>
+              <w:t xml:space="preserve">정책, 후보, resource profile은 재현 가능한 설정으로 관리해야 한다.</w:t>
+            </w:r>
+          </w:p>
+        </w:tc>
+        <w:tc>
+          <w:tcPr/>
+          <w:p>
+            <w:pPr>
+              <w:pStyle w:val="Compact"/>
+            </w:pPr>
+            <w:r>
+              <w:t xml:space="preserve">LLM policy, agent registry, CPU/GPU VM profile이 소스 코드와 분리된 설정 파일로 관리되어야 한다.</w:t>
+            </w:r>
+          </w:p>
+        </w:tc>
+      </w:tr>
+      <w:tr>
+        <w:tc>
+          <w:tcPr/>
+          <w:p>
+            <w:pPr>
+              <w:pStyle w:val="Compact"/>
+            </w:pPr>
+            <w:r>
+              <w:t xml:space="preserve">NFR-03</w:t>
+            </w:r>
+          </w:p>
+        </w:tc>
+        <w:tc>
+          <w:tcPr/>
+          <w:p>
+            <w:pPr>
+              <w:pStyle w:val="Compact"/>
+            </w:pPr>
+            <w:r>
+              <w:t xml:space="preserve">기본 검증은 외부 cloud credential 없이 실행 가능해야 한다.</w:t>
+            </w:r>
+          </w:p>
+        </w:tc>
+        <w:tc>
+          <w:tcPr/>
+          <w:p>
+            <w:pPr>
+              <w:pStyle w:val="Compact"/>
+            </w:pPr>
+            <w:r>
+              <w:t xml:space="preserve">로컬 환경에서 mock 또는 dry-run 방식으로 주요 기능 흐름을 검증할 수 있어야 한다.</w:t>
+            </w:r>
+          </w:p>
+        </w:tc>
+      </w:tr>
+      <w:tr>
+        <w:tc>
+          <w:tcPr/>
+          <w:p>
+            <w:pPr>
+              <w:pStyle w:val="Compact"/>
+            </w:pPr>
+            <w:r>
+              <w:t xml:space="preserve">NFR-04</w:t>
+            </w:r>
+          </w:p>
+        </w:tc>
+        <w:tc>
+          <w:tcPr/>
+          <w:p>
+            <w:pPr>
+              <w:pStyle w:val="Compact"/>
+            </w:pPr>
+            <w:r>
+              <w:t xml:space="preserve">prototype 검증과 production operation을 명확히 구분해야 한다.</w:t>
+            </w:r>
+          </w:p>
+        </w:tc>
+        <w:tc>
+          <w:tcPr/>
+          <w:p>
+            <w:pPr>
+              <w:pStyle w:val="Compact"/>
+            </w:pPr>
+            <w:r>
+              <w:t xml:space="preserve">문서와 출력에서 운영 환경 배포 완료, 실제 GPU VM 생성, live cluster 변경을 과장해 표현하지 않아야 한다.</w:t>
+            </w:r>
+          </w:p>
+        </w:tc>
+      </w:tr>
+      <w:tr>
+        <w:tc>
+          <w:tcPr/>
+          <w:p>
+            <w:pPr>
+              <w:pStyle w:val="Compact"/>
+            </w:pPr>
+            <w:r>
+              <w:t xml:space="preserve">NFR-05</w:t>
+            </w:r>
+          </w:p>
+        </w:tc>
+        <w:tc>
+          <w:tcPr/>
+          <w:p>
+            <w:pPr>
+              <w:pStyle w:val="Compact"/>
+            </w:pPr>
+            <w:r>
+              <w:t xml:space="preserve">LLM 선정 기준값과 최종 benchmark 결과를 명확히 구분해야 한다.</w:t>
+            </w:r>
+          </w:p>
+        </w:tc>
+        <w:tc>
+          <w:tcPr/>
+          <w:p>
+            <w:pPr>
+              <w:pStyle w:val="Compact"/>
+            </w:pPr>
+            <w:r>
+              <w:t xml:space="preserve">수동 정의 policy baseline은 prototype 입력값으로 설명하고, 최종 정량 평가는 별도 통제 실험이 필요함을 명시해야 한다.</w:t>
+            </w:r>
+          </w:p>
+        </w:tc>
+      </w:tr>
+      <w:tr>
+        <w:tc>
+          <w:tcPr/>
+          <w:p>
+            <w:pPr>
+              <w:pStyle w:val="Compact"/>
+            </w:pPr>
+            <w:r>
+              <w:t xml:space="preserve">NFR-06</w:t>
+            </w:r>
+          </w:p>
+        </w:tc>
+        <w:tc>
+          <w:tcPr/>
+          <w:p>
+            <w:pPr>
+              <w:pStyle w:val="Compact"/>
+            </w:pPr>
+            <w:r>
+              <w:t xml:space="preserve">실행 결과는 검토자가 추적할 수 있는 형태로 남아야 한다.</w:t>
+            </w:r>
+          </w:p>
+        </w:tc>
+        <w:tc>
+          <w:tcPr/>
+          <w:p>
+            <w:pPr>
+              <w:pStyle w:val="Compact"/>
+            </w:pPr>
+            <w:r>
+              <w:t xml:space="preserve">주요 검증 명령은 JSON 또는 문서화 가능한 출력 결과를 생성해야 한다.</w:t>
+            </w:r>
+          </w:p>
+        </w:tc>
+      </w:tr>
+    </w:tbl>
+    <w:bookmarkEnd w:id="12"/>
+    <w:bookmarkStart w:id="13" w:name="제출-산출물-요구사항"/>
+    <w:p>
+      <w:pPr>
+        <w:pStyle w:val="Heading2"/>
+      </w:pPr>
+      <w:r>
+        <w:t xml:space="preserve">5. 제출 산출물 요구사항</w:t>
+      </w:r>
+    </w:p>
+    <w:tbl>
+      <w:tblPr>
+        <w:tblStyle w:val="Table"/>
+        <w:tblW w:type="pct" w:w="5000"/>
+        <w:tblLayout w:type="fixed"/>
+        <w:tblLook w:firstRow="1" w:lastRow="0" w:firstColumn="0" w:lastColumn="0" w:noHBand="0" w:noVBand="0" w:val="0020"/>
+      </w:tblPr>
+      <w:tblGrid>
+        <w:gridCol w:w="2640"/>
+        <w:gridCol w:w="2640"/>
+        <w:gridCol w:w="2640"/>
+      </w:tblGrid>
+      <w:tr>
+        <w:trPr>
+          <w:tblHeader w:val="on"/>
+        </w:trPr>
+        <w:tc>
+          <w:tcPr/>
+          <w:p>
+            <w:pPr>
+              <w:pStyle w:val="Compact"/>
+            </w:pPr>
+            <w:r>
+              <w:t xml:space="preserve">필수 산출물</w:t>
+            </w:r>
+          </w:p>
+        </w:tc>
+        <w:tc>
+          <w:tcPr/>
+          <w:p>
+            <w:pPr>
+              <w:pStyle w:val="Compact"/>
+            </w:pPr>
+            <w:r>
+              <w:t xml:space="preserve">형식</w:t>
+            </w:r>
+          </w:p>
+        </w:tc>
+        <w:tc>
+          <w:tcPr/>
+          <w:p>
+            <w:pPr>
+              <w:pStyle w:val="Compact"/>
+            </w:pPr>
+            <w:r>
+              <w:t xml:space="preserve">요구사항</w:t>
+            </w:r>
+          </w:p>
+        </w:tc>
+      </w:tr>
+      <w:tr>
+        <w:tc>
+          <w:tcPr/>
+          <w:p>
+            <w:pPr>
+              <w:pStyle w:val="Compact"/>
+            </w:pPr>
+            <w:r>
+              <w:t xml:space="preserve">요구사항 정의서</w:t>
+            </w:r>
+          </w:p>
+        </w:tc>
+        <w:tc>
+          <w:tcPr/>
+          <w:p>
+            <w:pPr>
+              <w:pStyle w:val="Compact"/>
+            </w:pPr>
+            <w:r>
+              <w:t xml:space="preserve">Markdown, DOCX</w:t>
+            </w:r>
+          </w:p>
+        </w:tc>
+        <w:tc>
+          <w:tcPr/>
+          <w:p>
+            <w:pPr>
+              <w:pStyle w:val="Compact"/>
+            </w:pPr>
+            <w:r>
+              <w:t xml:space="preserve">과제 범위, 기능 요구사항, 비기능 요구사항, 검증 기준, 제외 범위를 정의해야 한다.</w:t>
+            </w:r>
+          </w:p>
+        </w:tc>
+      </w:tr>
+      <w:tr>
+        <w:tc>
+          <w:tcPr/>
+          <w:p>
+            <w:pPr>
+              <w:pStyle w:val="Compact"/>
+            </w:pPr>
+            <w:r>
+              <w:t xml:space="preserve">기능/API 가이드</w:t>
+            </w:r>
+          </w:p>
+        </w:tc>
+        <w:tc>
+          <w:tcPr/>
+          <w:p>
+            <w:pPr>
+              <w:pStyle w:val="Compact"/>
+            </w:pPr>
+            <w:r>
+              <w:t xml:space="preserve">Markdown</w:t>
+            </w:r>
+          </w:p>
+        </w:tc>
+        <w:tc>
+          <w:tcPr/>
+          <w:p>
+            <w:pPr>
+              <w:pStyle w:val="Compact"/>
+            </w:pPr>
+            <w:r>
+              <w:t xml:space="preserve">API 실행 방법, endpoint, request/response 구조를 설명해야 한다.</w:t>
+            </w:r>
+          </w:p>
+        </w:tc>
+      </w:tr>
+      <w:tr>
+        <w:tc>
+          <w:tcPr/>
+          <w:p>
+            <w:pPr>
+              <w:pStyle w:val="Compact"/>
+            </w:pPr>
+            <w:r>
+              <w:t xml:space="preserve">Swagger/OpenAPI 계약</w:t>
+            </w:r>
+          </w:p>
+        </w:tc>
+        <w:tc>
+          <w:tcPr/>
+          <w:p>
+            <w:pPr>
+              <w:pStyle w:val="Compact"/>
+            </w:pPr>
+            <w:r>
+              <w:t xml:space="preserve">YAML</w:t>
+            </w:r>
+          </w:p>
+        </w:tc>
+        <w:tc>
+          <w:tcPr/>
+          <w:p>
+            <w:pPr>
+              <w:pStyle w:val="Compact"/>
+            </w:pPr>
+            <w:r>
+              <w:t xml:space="preserve">HTTP API 계약을 표준 형식으로 제공해야 한다.</w:t>
+            </w:r>
+          </w:p>
+        </w:tc>
+      </w:tr>
+      <w:tr>
+        <w:tc>
+          <w:tcPr/>
+          <w:p>
+            <w:pPr>
+              <w:pStyle w:val="Compact"/>
+            </w:pPr>
+            <w:r>
+              <w:t xml:space="preserve">설치 및 실행 가이드</w:t>
+            </w:r>
+          </w:p>
+        </w:tc>
+        <w:tc>
+          <w:tcPr/>
+          <w:p>
+            <w:pPr>
+              <w:pStyle w:val="Compact"/>
+            </w:pPr>
+            <w:r>
+              <w:t xml:space="preserve">Markdown</w:t>
+            </w:r>
+          </w:p>
+        </w:tc>
+        <w:tc>
+          <w:tcPr/>
+          <w:p>
+            <w:pPr>
+              <w:pStyle w:val="Compact"/>
+            </w:pPr>
+            <w:r>
+              <w:t xml:space="preserve">Go 환경 설정, CLI/API 실행, mock mode, 기대 출력을 설명해야 한다.</w:t>
+            </w:r>
+          </w:p>
+        </w:tc>
+      </w:tr>
+      <w:tr>
+        <w:tc>
+          <w:tcPr/>
+          <w:p>
+            <w:pPr>
+              <w:pStyle w:val="Compact"/>
+            </w:pPr>
+            <w:r>
               <w:t xml:space="preserve">테스트 가이드</w:t>
             </w:r>
           </w:p>
@@ -1169,34 +1211,125 @@
               <w:pStyle w:val="Compact"/>
             </w:pPr>
             <w:r>
-              <w:rPr>
-                <w:rStyle w:val="VerbatimChar"/>
-              </w:rPr>
-              <w:t xml:space="preserve">docs/submission/test_guide.md</w:t>
-            </w:r>
-          </w:p>
-        </w:tc>
-        <w:tc>
-          <w:tcPr/>
-          <w:p>
-            <w:pPr>
-              <w:pStyle w:val="Compact"/>
-            </w:pPr>
-            <w:r>
-              <w:t xml:space="preserve">Go 테스트, team-validation, 기대 신호, 로그 보존 방법을 설명해야 한다.</w:t>
+              <w:t xml:space="preserve">Go test, team-validation, 실패 로그 보존 방법을 설명해야 한다.</w:t>
+            </w:r>
+          </w:p>
+        </w:tc>
+      </w:tr>
+      <w:tr>
+        <w:tc>
+          <w:tcPr/>
+          <w:p>
+            <w:pPr>
+              <w:pStyle w:val="Compact"/>
+            </w:pPr>
+            <w:r>
+              <w:t xml:space="preserve">LLM 운영 관리 구조 설계서</w:t>
+            </w:r>
+          </w:p>
+        </w:tc>
+        <w:tc>
+          <w:tcPr/>
+          <w:p>
+            <w:pPr>
+              <w:pStyle w:val="Compact"/>
+            </w:pPr>
+            <w:r>
+              <w:t xml:space="preserve">Markdown, DOCX</w:t>
+            </w:r>
+          </w:p>
+        </w:tc>
+        <w:tc>
+          <w:tcPr/>
+          <w:p>
+            <w:pPr>
+              <w:pStyle w:val="Compact"/>
+            </w:pPr>
+            <w:r>
+              <w:t xml:space="preserve">LLM 후보 선정과 운영 관리 구조를 설명해야 한다.</w:t>
+            </w:r>
+          </w:p>
+        </w:tc>
+      </w:tr>
+      <w:tr>
+        <w:tc>
+          <w:tcPr/>
+          <w:p>
+            <w:pPr>
+              <w:pStyle w:val="Compact"/>
+            </w:pPr>
+            <w:r>
+              <w:t xml:space="preserve">에이전트 등록 관리 프로토타입</w:t>
+            </w:r>
+          </w:p>
+        </w:tc>
+        <w:tc>
+          <w:tcPr/>
+          <w:p>
+            <w:pPr>
+              <w:pStyle w:val="Compact"/>
+            </w:pPr>
+            <w:r>
+              <w:t xml:space="preserve">Markdown, DOCX</w:t>
+            </w:r>
+          </w:p>
+        </w:tc>
+        <w:tc>
+          <w:tcPr/>
+          <w:p>
+            <w:pPr>
+              <w:pStyle w:val="Compact"/>
+            </w:pPr>
+            <w:r>
+              <w:t xml:space="preserve">에이전트 등록 정보, role, bounded action, 검증 방식을 설명해야 한다.</w:t>
+            </w:r>
+          </w:p>
+        </w:tc>
+      </w:tr>
+      <w:tr>
+        <w:tc>
+          <w:tcPr/>
+          <w:p>
+            <w:pPr>
+              <w:pStyle w:val="Compact"/>
+            </w:pPr>
+            <w:r>
+              <w:t xml:space="preserve">AI 응용 배포·제어 추론 최적화 전략 설계서</w:t>
+            </w:r>
+          </w:p>
+        </w:tc>
+        <w:tc>
+          <w:tcPr/>
+          <w:p>
+            <w:pPr>
+              <w:pStyle w:val="Compact"/>
+            </w:pPr>
+            <w:r>
+              <w:t xml:space="preserve">Markdown, DOCX</w:t>
+            </w:r>
+          </w:p>
+        </w:tc>
+        <w:tc>
+          <w:tcPr/>
+          <w:p>
+            <w:pPr>
+              <w:pStyle w:val="Compact"/>
+            </w:pPr>
+            <w:r>
+              <w:t xml:space="preserve">CPU/GPU VM 기반 배치 판단과 배포·제어 전략을 설명해야 한다.</w:t>
             </w:r>
           </w:p>
         </w:tc>
       </w:tr>
     </w:tbl>
     <w:bookmarkEnd w:id="13"/>
-    <w:bookmarkStart w:id="14" w:name="개발-가이드-요구사항"/>
+    <w:bookmarkStart w:id="14" w:name="개발-및-검증-요구사항"/>
     <w:p>
       <w:pPr>
         <w:pStyle w:val="Heading2"/>
       </w:pPr>
       <w:r>
-        <w:t xml:space="preserve">6. 개발 가이드 요구사항</w:t>
+        <w:t xml:space="preserve">6. 개발 및 검증 요구사항</w:t>
       </w:r>
     </w:p>
     <w:p>
@@ -1204,7 +1337,7 @@
         <w:pStyle w:val="FirstParagraph"/>
       </w:pPr>
       <w:r>
-        <w:t xml:space="preserve">개발 가이드와 보조 기록은 다음 내용을 문서화해야 합니다.</w:t>
+        <w:t xml:space="preserve">개발 및 검증 과정은 다음 조건을 만족해야 합니다.</w:t>
       </w:r>
     </w:p>
     <w:p>
@@ -1216,7 +1349,7 @@
         </w:numPr>
       </w:pPr>
       <w:r>
-        <w:t xml:space="preserve">API/CLI 프로토타입 구현을 위한 Go 언어 개발</w:t>
+        <w:t xml:space="preserve">Go 기반 API/CLI로 핵심 기능을 실행할 수 있어야 한다.</w:t>
       </w:r>
     </w:p>
     <w:p>
@@ -1228,7 +1361,7 @@
         </w:numPr>
       </w:pPr>
       <w:r>
-        <w:t xml:space="preserve">2종 이상 LLM 또는 코딩 에이전트 역할을 이용한 교차 검증</w:t>
+        <w:t xml:space="preserve">2종 이상 LLM 또는 코딩 에이전트 역할을 활용한 교차 검토 기록을 남겨야 한다.</w:t>
       </w:r>
     </w:p>
     <w:p>
@@ -1240,7 +1373,7 @@
         </w:numPr>
       </w:pPr>
       <w:r>
-        <w:t xml:space="preserve">정리된 대표 프롬프트 template 기반의 프롬프트 공유 문서</w:t>
+        <w:t xml:space="preserve">프롬프트 공유 문서는 민감정보를 제거한 대표 template 중심으로 작성해야 한다.</w:t>
       </w:r>
     </w:p>
     <w:p>
@@ -1252,7 +1385,7 @@
         </w:numPr>
       </w:pPr>
       <w:r>
-        <w:t xml:space="preserve">로그와 오류 메시지 기반 검증 기록</w:t>
+        <w:t xml:space="preserve">오류 발생 시 command, working directory, stdout/stderr, 환경 정보를 보존해야 한다.</w:t>
       </w:r>
     </w:p>
     <w:p>
@@ -1264,7 +1397,19 @@
         </w:numPr>
       </w:pPr>
       <w:r>
-        <w:t xml:space="preserve">생성 문서, README link, DOCX 존재 여부, 프로토타입 경계 문장에 대한 사람 검토</w:t>
+        <w:t xml:space="preserve">생성 문서와 DOCX 제출본은 실제 파일 존재 여부를 확인한 뒤 사용 가능하다고 표시해야 한다.</w:t>
+      </w:r>
+    </w:p>
+    <w:p>
+      <w:pPr>
+        <w:pStyle w:val="Compact"/>
+        <w:numPr>
+          <w:ilvl w:val="0"/>
+          <w:numId w:val="1003"/>
+        </w:numPr>
+      </w:pPr>
+      <w:r>
+        <w:t xml:space="preserve">사람 검토자는 prototype boundary와 benchmark boundary가 문서에 명확히 들어갔는지 확인해야 한다.</w:t>
       </w:r>
     </w:p>
     <w:p>
@@ -1272,7 +1417,7 @@
         <w:pStyle w:val="FirstParagraph"/>
       </w:pPr>
       <w:r>
-        <w:t xml:space="preserve">실제 사용 여부가 확인되지 않은 특정 LLM vendor명이나 coding-agent product명을 임의로 만들지 않습니다. 문서화에는</w:t>
+        <w:t xml:space="preserve">실제 사용 여부가 확인되지 않은 특정 LLM vendor명이나 coding-agent product명을 임의로 만들지 않습니다. 필요한 경우</w:t>
       </w:r>
       <w:r>
         <w:t xml:space="preserve"> </w:t>
@@ -1320,17 +1465,17 @@
         <w:t xml:space="preserve">secondary review agent</w:t>
       </w:r>
       <w:r>
-        <w:t xml:space="preserve">와 같은 중립적 역할명을 사용할 수 있습니다.</w:t>
+        <w:t xml:space="preserve">와 같은 중립적 역할명을 사용합니다.</w:t>
       </w:r>
     </w:p>
     <w:bookmarkEnd w:id="14"/>
-    <w:bookmarkStart w:id="15" w:name="검증-방법"/>
+    <w:bookmarkStart w:id="15" w:name="검증-기준"/>
     <w:p>
       <w:pPr>
         <w:pStyle w:val="Heading2"/>
       </w:pPr>
       <w:r>
-        <w:t xml:space="preserve">7. 검증 방법</w:t>
+        <w:t xml:space="preserve">7. 검증 기준</w:t>
       </w:r>
     </w:p>
     <w:p>
@@ -1338,7 +1483,7 @@
         <w:pStyle w:val="FirstParagraph"/>
       </w:pPr>
       <w:r>
-        <w:t xml:space="preserve">기본 검증 방법은 로컬 Go 실행입니다.</w:t>
+        <w:t xml:space="preserve">기본 검증은 로컬 Go 실행으로 수행할 수 있어야 합니다.</w:t>
       </w:r>
     </w:p>
     <w:p>
@@ -1406,7 +1551,7 @@
         <w:pStyle w:val="FirstParagraph"/>
       </w:pPr>
       <w:r>
-        <w:t xml:space="preserve">기대되는 프로토타입 수준의 검증 신호는 다음과 같습니다.</w:t>
+        <w:t xml:space="preserve">기대되는 prototype-level signal은 다음과 같습니다.</w:t>
       </w:r>
     </w:p>
     <w:p>
@@ -1461,17 +1606,17 @@
         <w:pStyle w:val="FirstParagraph"/>
       </w:pPr>
       <w:r>
-        <w:t xml:space="preserve">이 검증은 기능 프로토타입 동작을 확인합니다. 운영 성능, 표준 LLM 벤치마크 품질, 실제 GPU VM 프로비저닝을 증명하지는 않습니다.</w:t>
+        <w:t xml:space="preserve">위 검증은 기능 흐름이 요구사항을 만족하는지 확인하기 위한 것입니다. 운영 성능, 표준 LLM benchmark 품질, 실제 GPU VM provisioning을 증명하지 않습니다.</w:t>
       </w:r>
     </w:p>
     <w:bookmarkEnd w:id="15"/>
-    <w:bookmarkStart w:id="16" w:name="프로토타입-경계"/>
+    <w:bookmarkStart w:id="16" w:name="경계-및-제약-조건"/>
     <w:p>
       <w:pPr>
         <w:pStyle w:val="Heading2"/>
       </w:pPr>
       <w:r>
-        <w:t xml:space="preserve">8. 프로토타입 경계</w:t>
+        <w:t xml:space="preserve">8. 경계 및 제약 조건</w:t>
       </w:r>
     </w:p>
     <w:p>
@@ -1479,19 +1624,7 @@
         <w:pStyle w:val="FirstParagraph"/>
       </w:pPr>
       <w:r>
-        <w:t xml:space="preserve">현재 LLM 정책 값은</w:t>
-      </w:r>
-      <w:r>
-        <w:t xml:space="preserve"> </w:t>
-      </w:r>
-      <w:r>
-        <w:rPr>
-          <w:rStyle w:val="VerbatimChar"/>
-        </w:rPr>
-        <w:t xml:space="preserve">config/ops_llm_benchmark.json</w:t>
-      </w:r>
-      <w:r>
-        <w:t xml:space="preserve">에 수동 정의된 프로토타입 정책 기준값입니다. 최종 표준 벤치마크 결과가 아닙니다. 최종 정량 보고를 위해서는 고정 프롬프트, 고정 데이터셋, 반복 가능한 지표, 문서화된 scoring rule을 갖춘 통제된 per-model Ops 평가가 필요합니다.</w:t>
+        <w:t xml:space="preserve">현재 LLM policy value는 prototype 요구사항 검증을 위한 기준 입력값입니다. 최종 표준 benchmark 결과가 아니며, 최종 정량 보고를 위해서는 고정 prompt, 고정 dataset, 반복 가능한 metric, 문서화된 scoring rule을 갖춘 통제된 per-model Ops 평가가 필요합니다.</w:t>
       </w:r>
     </w:p>
     <w:p>
@@ -1499,7 +1632,7 @@
         <w:pStyle w:val="BodyText"/>
       </w:pPr>
       <w:r>
-        <w:t xml:space="preserve">CPU/GPU VM 배치 로직은 추천 및 배포 계획 생성 프로토타입입니다. 운영 cloud scheduler, Kubernetes scheduler, GPU device plugin, CB-Tumblebug 프로비저닝을 대체하지 않습니다.</w:t>
+        <w:t xml:space="preserve">CPU/GPU VM 배치 판단은 추천 및 배포 계획 생성 요구사항을 검증하기 위한 기능입니다. 운영 cloud scheduler, Kubernetes scheduler, GPU device plugin, CB-Tumblebug provisioning을 대체하지 않습니다.</w:t>
       </w:r>
     </w:p>
     <w:p>
@@ -1522,7 +1655,7 @@
         <w:t xml:space="preserve"> </w:t>
       </w:r>
       <w:r>
-        <w:t xml:space="preserve">mode는 live Kubernetes cluster를 변경하지 않습니다.</w:t>
+        <w:t xml:space="preserve">mode는 live Kubernetes cluster를 변경하지 않아야 합니다. 실제 cloud credential과 GPU VM 환경이 필요한 실험은 AI-Infra 또는 CB-Tumblebug 연동 단계에서 별도로 수행해야 합니다.</w:t>
       </w:r>
     </w:p>
     <w:bookmarkEnd w:id="16"/>

</xml_diff>